<commit_message>
Refine Word plan workflow and linked research
</commit_message>
<xml_diff>
--- a/public/templates/mountain-plan-template.docx
+++ b/public/templates/mountain-plan-template.docx
@@ -4108,18 +4108,19 @@
         <w:tblStyle w:val="a3"/>
         <w:tblW w:w="5841" w:type="pct"/>
         <w:tblInd w:w="-714" w:type="dxa"/>
+        <w:tblLayout w:type="fixed"/>
         <w:tblLook w:val="04A0" w:firstRow="1" w:lastRow="0" w:firstColumn="1" w:lastColumn="0" w:noHBand="0" w:noVBand="1"/>
       </w:tblPr>
       <w:tblGrid>
-        <w:gridCol w:w="1272"/>
-        <w:gridCol w:w="1564"/>
-        <w:gridCol w:w="2387"/>
-        <w:gridCol w:w="4700"/>
+        <w:gridCol w:w="1296"/>
+        <w:gridCol w:w="1800"/>
+        <w:gridCol w:w="1181"/>
+        <w:gridCol w:w="5674"/>
       </w:tblGrid>
       <w:tr>
         <w:tc>
           <w:tcPr>
-            <w:tcW w:w="641" w:type="pct"/>
+            <w:tcW w:w="1296" w:type="dxa"/>
             <w:vMerge w:val="restart"/>
             <w:shd w:val="clear" w:color="auto" w:fill="D9D9D9" w:themeFill="background1" w:themeFillShade="D9"/>
           </w:tcPr>
@@ -4139,7 +4140,7 @@
         </w:tc>
         <w:tc>
           <w:tcPr>
-            <w:tcW w:w="788" w:type="pct"/>
+            <w:tcW w:w="1800" w:type="dxa"/>
             <w:shd w:val="clear" w:color="auto" w:fill="D9D9D9" w:themeFill="background1" w:themeFillShade="D9"/>
           </w:tcPr>
           <w:p>
@@ -4158,7 +4159,7 @@
         </w:tc>
         <w:tc>
           <w:tcPr>
-            <w:tcW w:w="1203" w:type="pct"/>
+            <w:tcW w:w="1181" w:type="dxa"/>
             <w:shd w:val="clear" w:color="auto" w:fill="D9D9D9" w:themeFill="background1" w:themeFillShade="D9"/>
           </w:tcPr>
           <w:p>
@@ -4177,7 +4178,7 @@
         </w:tc>
         <w:tc>
           <w:tcPr>
-            <w:tcW w:w="2368" w:type="pct"/>
+            <w:tcW w:w="5674" w:type="dxa"/>
             <w:shd w:val="clear" w:color="auto" w:fill="D9D9D9" w:themeFill="background1" w:themeFillShade="D9"/>
           </w:tcPr>
           <w:p>
@@ -4212,7 +4213,7 @@
         </w:tc>
         <w:tc>
           <w:tcPr>
-            <w:tcW w:w="788" w:type="pct"/>
+            <w:tcW w:w="1800" w:type="dxa"/>
             <w:vMerge w:val="restart"/>
             <w:shd w:val="clear" w:color="auto" w:fill="D9D9D9" w:themeFill="background1" w:themeFillShade="D9"/>
           </w:tcPr>
@@ -4232,19 +4233,19 @@
         </w:tc>
         <w:tc>
           <w:tcPr>
-            <w:tcW w:w="1203" w:type="pct"/>
-          </w:tcPr>
-          <w:p>
-            <w:pPr>
-              <w:rPr>
-                <w:rFonts w:ascii="ＭＳ Ｐゴシック" w:eastAsia="ＭＳ Ｐゴシック" w:hAnsi="ＭＳ Ｐゴシック"/>
-              </w:rPr>
-            </w:pPr>
-          </w:p>
-        </w:tc>
-        <w:tc>
-          <w:tcPr>
-            <w:tcW w:w="2368" w:type="pct"/>
+            <w:tcW w:w="1181" w:type="dxa"/>
+          </w:tcPr>
+          <w:p>
+            <w:pPr>
+              <w:rPr>
+                <w:rFonts w:ascii="ＭＳ Ｐゴシック" w:eastAsia="ＭＳ Ｐゴシック" w:hAnsi="ＭＳ Ｐゴシック"/>
+              </w:rPr>
+            </w:pPr>
+          </w:p>
+        </w:tc>
+        <w:tc>
+          <w:tcPr>
+            <w:tcW w:w="5674" w:type="dxa"/>
           </w:tcPr>
           <w:p>
             <w:pPr>
@@ -4322,19 +4323,19 @@
         </w:tc>
         <w:tc>
           <w:tcPr>
-            <w:tcW w:w="1203" w:type="pct"/>
-          </w:tcPr>
-          <w:p>
-            <w:pPr>
-              <w:rPr>
-                <w:rFonts w:ascii="ＭＳ Ｐゴシック" w:eastAsia="ＭＳ Ｐゴシック" w:hAnsi="ＭＳ Ｐゴシック"/>
-              </w:rPr>
-            </w:pPr>
-          </w:p>
-        </w:tc>
-        <w:tc>
-          <w:tcPr>
-            <w:tcW w:w="2368" w:type="pct"/>
+            <w:tcW w:w="1181" w:type="dxa"/>
+          </w:tcPr>
+          <w:p>
+            <w:pPr>
+              <w:rPr>
+                <w:rFonts w:ascii="ＭＳ Ｐゴシック" w:eastAsia="ＭＳ Ｐゴシック" w:hAnsi="ＭＳ Ｐゴシック"/>
+              </w:rPr>
+            </w:pPr>
+          </w:p>
+        </w:tc>
+        <w:tc>
+          <w:tcPr>
+            <w:tcW w:w="5674" w:type="dxa"/>
           </w:tcPr>
           <w:p>
             <w:pPr>
@@ -4398,7 +4399,7 @@
         </w:tc>
         <w:tc>
           <w:tcPr>
-            <w:tcW w:w="788" w:type="pct"/>
+            <w:tcW w:w="1800" w:type="dxa"/>
             <w:shd w:val="clear" w:color="auto" w:fill="D9D9D9" w:themeFill="background1" w:themeFillShade="D9"/>
           </w:tcPr>
           <w:p>
@@ -4417,19 +4418,19 @@
         </w:tc>
         <w:tc>
           <w:tcPr>
-            <w:tcW w:w="1203" w:type="pct"/>
-          </w:tcPr>
-          <w:p>
-            <w:pPr>
-              <w:rPr>
-                <w:rFonts w:ascii="ＭＳ Ｐゴシック" w:eastAsia="ＭＳ Ｐゴシック" w:hAnsi="ＭＳ Ｐゴシック"/>
-              </w:rPr>
-            </w:pPr>
-          </w:p>
-        </w:tc>
-        <w:tc>
-          <w:tcPr>
-            <w:tcW w:w="2368" w:type="pct"/>
+            <w:tcW w:w="1181" w:type="dxa"/>
+          </w:tcPr>
+          <w:p>
+            <w:pPr>
+              <w:rPr>
+                <w:rFonts w:ascii="ＭＳ Ｐゴシック" w:eastAsia="ＭＳ Ｐゴシック" w:hAnsi="ＭＳ Ｐゴシック"/>
+              </w:rPr>
+            </w:pPr>
+          </w:p>
+        </w:tc>
+        <w:tc>
+          <w:tcPr>
+            <w:tcW w:w="5674" w:type="dxa"/>
           </w:tcPr>
           <w:p>
             <w:pPr>
@@ -4457,7 +4458,7 @@
         </w:tc>
         <w:tc>
           <w:tcPr>
-            <w:tcW w:w="788" w:type="pct"/>
+            <w:tcW w:w="1800" w:type="dxa"/>
             <w:shd w:val="clear" w:color="auto" w:fill="D9D9D9" w:themeFill="background1" w:themeFillShade="D9"/>
           </w:tcPr>
           <w:p>
@@ -4476,19 +4477,19 @@
         </w:tc>
         <w:tc>
           <w:tcPr>
-            <w:tcW w:w="1203" w:type="pct"/>
-          </w:tcPr>
-          <w:p>
-            <w:pPr>
-              <w:rPr>
-                <w:rFonts w:ascii="ＭＳ Ｐゴシック" w:eastAsia="ＭＳ Ｐゴシック" w:hAnsi="ＭＳ Ｐゴシック"/>
-              </w:rPr>
-            </w:pPr>
-          </w:p>
-        </w:tc>
-        <w:tc>
-          <w:tcPr>
-            <w:tcW w:w="2368" w:type="pct"/>
+            <w:tcW w:w="1181" w:type="dxa"/>
+          </w:tcPr>
+          <w:p>
+            <w:pPr>
+              <w:rPr>
+                <w:rFonts w:ascii="ＭＳ Ｐゴシック" w:eastAsia="ＭＳ Ｐゴシック" w:hAnsi="ＭＳ Ｐゴシック"/>
+              </w:rPr>
+            </w:pPr>
+          </w:p>
+        </w:tc>
+        <w:tc>
+          <w:tcPr>
+            <w:tcW w:w="5674" w:type="dxa"/>
           </w:tcPr>
           <w:p>
             <w:pPr>
@@ -4516,7 +4517,7 @@
         </w:tc>
         <w:tc>
           <w:tcPr>
-            <w:tcW w:w="788" w:type="pct"/>
+            <w:tcW w:w="1800" w:type="dxa"/>
             <w:shd w:val="clear" w:color="auto" w:fill="D9D9D9" w:themeFill="background1" w:themeFillShade="D9"/>
           </w:tcPr>
           <w:p>
@@ -4535,7 +4536,7 @@
         </w:tc>
         <w:tc>
           <w:tcPr>
-            <w:tcW w:w="1203" w:type="pct"/>
+            <w:tcW w:w="1181" w:type="dxa"/>
           </w:tcPr>
           <w:p>
             <w:pPr>
@@ -4553,7 +4554,7 @@
         </w:tc>
         <w:tc>
           <w:tcPr>
-            <w:tcW w:w="2368" w:type="pct"/>
+            <w:tcW w:w="5674" w:type="dxa"/>
           </w:tcPr>
           <w:p>
             <w:pPr>
@@ -4587,7 +4588,7 @@
         </w:tc>
         <w:tc>
           <w:tcPr>
-            <w:tcW w:w="788" w:type="pct"/>
+            <w:tcW w:w="1800" w:type="dxa"/>
             <w:shd w:val="clear" w:color="auto" w:fill="D9D9D9" w:themeFill="background1" w:themeFillShade="D9"/>
           </w:tcPr>
           <w:p>
@@ -4606,19 +4607,19 @@
         </w:tc>
         <w:tc>
           <w:tcPr>
-            <w:tcW w:w="1203" w:type="pct"/>
-          </w:tcPr>
-          <w:p>
-            <w:pPr>
-              <w:rPr>
-                <w:rFonts w:ascii="ＭＳ Ｐゴシック" w:eastAsia="ＭＳ Ｐゴシック" w:hAnsi="ＭＳ Ｐゴシック"/>
-              </w:rPr>
-            </w:pPr>
-          </w:p>
-        </w:tc>
-        <w:tc>
-          <w:tcPr>
-            <w:tcW w:w="2368" w:type="pct"/>
+            <w:tcW w:w="1181" w:type="dxa"/>
+          </w:tcPr>
+          <w:p>
+            <w:pPr>
+              <w:rPr>
+                <w:rFonts w:ascii="ＭＳ Ｐゴシック" w:eastAsia="ＭＳ Ｐゴシック" w:hAnsi="ＭＳ Ｐゴシック"/>
+              </w:rPr>
+            </w:pPr>
+          </w:p>
+        </w:tc>
+        <w:tc>
+          <w:tcPr>
+            <w:tcW w:w="5674" w:type="dxa"/>
           </w:tcPr>
           <w:p>
             <w:pPr>

</xml_diff>